<commit_message>
docs: notes v4.2 — correctifs grants hérités et corps des fonctions Python
Co-Authored-By: Claude Opus 5.5 <noreply@anthropic.com>
</commit_message>
<xml_diff>
--- a/docs/DR_Backup_Notes_de_Version_v4.2.docx
+++ b/docs/DR_Backup_Notes_de_Version_v4.2.docx
@@ -547,6 +547,53 @@
       </w:r>
     </w:p>
     <w:p>
+      <w:pPr>
+        <w:pStyle w:val="Heading2"/>
+        <w:jc w:val="left"/>
+      </w:pPr>
+      <w:r>
+        <w:rPr>
+          <w:color w:val="1F497D"/>
+        </w:rPr>
+        <w:t>2.4 Permissions héritées exportées comme permissions directes</w:t>
+      </w:r>
+    </w:p>
+    <w:p>
+      <w:r>
+        <w:t>La commande SHOW GRANTS sur un objet renvoie aussi les droits hérités de son catalog et de son schéma. L'export les réécrivait tous comme des droits posés sur l'objet lui-même : une restauration les aurait matérialisés en droits explicites, objet par objet. Un droit retiré plus tard au niveau du catalog serait alors resté actif sur chaque table. Seuls les droits posés sur l'objet lui-même sont désormais exportés ; sur l'environnement de test, le fichier des permissions est passé de 308 à 150 lignes.</w:t>
+      </w:r>
+    </w:p>
+    <w:p>
+      <w:pPr>
+        <w:ind w:left="283"/>
+      </w:pPr>
+      <w:r>
+        <w:rPr>
+          <w:b/>
+          <w:color w:val="C00000"/>
+          <w:sz w:val="20"/>
+        </w:rPr>
+        <w:t>Attention : les fichiers 04_grants.sql produits par les versions précédentes contiennent ces droits hérités. Pour une restauration des permissions, utiliser de préférence un backup réalisé avec la version 4.2.</w:t>
+      </w:r>
+    </w:p>
+    <w:p>
+      <w:pPr>
+        <w:pStyle w:val="Heading2"/>
+        <w:jc w:val="left"/>
+      </w:pPr>
+      <w:r>
+        <w:rPr>
+          <w:color w:val="1F497D"/>
+        </w:rPr>
+        <w:t>2.5 Fonctions Python</w:t>
+      </w:r>
+    </w:p>
+    <w:p>
+      <w:r>
+        <w:t>Le corps d'une fonction Python gagnait une ligne vide au début et à la fin à chaque cycle de sauvegarde et de restauration. Il est désormais restauré à l'identique.</w:t>
+      </w:r>
+    </w:p>
+    <w:p>
       <w:r>
         <w:br w:type="page"/>
       </w:r>

</xml_diff>

<commit_message>
docs: corrections de revue — copie manuelle de lib/, premier run plus long, plan v4.3
- notes : ne plus conseiller de supprimer une copie de lib/ voisine de notebooks copiés ;
  avertir que le premier run fait la copie initiale des volumes ; procédure cohérente
- guide/notes : liste exacte des notebooks qui dépendent de lib/
- ajout de la spec et du plan v4.3 (uc_io + loguru)

Co-Authored-By: Claude Opus 5.5 <noreply@anthropic.com>
</commit_message>
<xml_diff>
--- a/docs/DR_Backup_Notes_de_Version_v4.2.docx
+++ b/docs/DR_Backup_Notes_de_Version_v4.2.docx
@@ -1415,7 +1415,7 @@
         <w:pStyle w:val="ListNumber"/>
       </w:pPr>
       <w:r>
-        <w:t>Extraire l'archive, en conservant le dossier lib/ : la plupart des notebooks en dépendent (seuls 07_restore et 11_restore_grants sont autonomes).</w:t>
+        <w:t>Extraire l'archive, en conservant le dossier lib/ : les notebooks d'export (01, 03, 04, 14) et de restauration (08, 09, 12, 13, 15) en dépendent.</w:t>
       </w:r>
     </w:p>
     <w:p>
@@ -1423,7 +1423,7 @@
         <w:pStyle w:val="ListNumber"/>
       </w:pPr>
       <w:r>
-        <w:t>Reporter dans databricks.yml vos valeurs (backup_root, host de chaque cible, notification_email, rétentions) et le nouveau bloc driver_node_type_id du job quotidien.</w:t>
+        <w:t>Reporter dans votre databricks.yml vos valeurs (backup_root, host de chaque cible, notification_email, rétentions) et le nouveau bloc driver_node_type_id du job quotidien.</w:t>
       </w:r>
     </w:p>
     <w:p>
@@ -1431,7 +1431,7 @@
         <w:pStyle w:val="ListNumber"/>
       </w:pPr>
       <w:r>
-        <w:t>Dans votre databricks.yml : supprimer la variable lib_path (bloc variables et cibles), remplacer ${var.lib_path} par ${workspace.file_path}/lib dans les paramètres des jobs, et ajouter lib_path: ${workspace.file_path}/lib aux paramètres du job dr-backup-monthly.</w:t>
+        <w:t>Toujours dans votre databricks.yml : supprimer la variable lib_path (bloc variables et cibles), remplacer ${var.lib_path} par ${workspace.file_path}/lib dans les paramètres des jobs, et ajouter lib_path: ${workspace.file_path}/lib aux paramètres du job dr-backup-monthly (sans effet dans cette version, requis par la suivante).</w:t>
       </w:r>
     </w:p>
     <w:p>
@@ -1489,7 +1489,20 @@
           <w:color w:val="707070"/>
           <w:sz w:val="20"/>
         </w:rPr>
-        <w:t>Note : lib/ est déployé par databricks bundle deploy avec les notebooks : aucun chemin à renseigner. Une copie de lib/ faite à la main dans le workspace n'est plus utilisée et peut être supprimée.</w:t>
+        <w:t>Note : lib/ est déployé par databricks bundle deploy avec les notebooks : aucun chemin à renseigner. Un notebook cherche lib/ dans le dossier voisin du sien : ouvrir les notebooks depuis le dossier du bundle (…/.bundle/dr-backup/&lt;cible&gt;/files/notebooks). Si vous gardez une copie des notebooks ailleurs dans le workspace, gardez lib/ à jour à côté d'elle.</w:t>
+      </w:r>
+    </w:p>
+    <w:p>
+      <w:pPr>
+        <w:ind w:left="283"/>
+      </w:pPr>
+      <w:r>
+        <w:rPr>
+          <w:i/>
+          <w:color w:val="707070"/>
+          <w:sz w:val="20"/>
+        </w:rPr>
+        <w:t>Note : le premier run après la mise à jour peut être nettement plus long : il exporte pour la première fois les volumes et fonctions, et réalise la copie initiale complète des fichiers des volumes managés. Les runs suivants ne copient que les fichiers modifiés. Le lancer manuellement et en suivre la durée avant de réactiver la planification.</w:t>
       </w:r>
     </w:p>
     <w:p>

</xml_diff>

<commit_message>
feat: contrôle de visibilité des tables protégées (diag_04_protected_tables)
DEEP CLONE refuse les tables à filtre de lignes ou masque de colonnes ; une copie par lecture
ne serait complète que si le compte qui lit voit toutes les lignes et les valeurs réelles.
Le notebook appelle chaque fonction de filtre et de masque avec des valeurs de test (dont
NULL) sous l'identité qui l'exécute, et rend COMPLETE / LIGNES_FILTREES / VALEURS_MASQUEES /
INDETERMINE par table. Vérifié sur KeyIT dev contre les lignes et valeurs réellement
visibles : 4 cas sur 4. Notes de version §3.3 (dont le piège is_account_group_member).

Co-Authored-By: Claude Opus 5.5 <noreply@anthropic.com>
</commit_message>
<xml_diff>
--- a/docs/DR_Backup_Notes_de_Version_v4.2.docx
+++ b/docs/DR_Backup_Notes_de_Version_v4.2.docx
@@ -1521,6 +1521,27 @@
     </w:p>
     <w:p>
       <w:pPr>
+        <w:pStyle w:val="ListBullet"/>
+      </w:pPr>
+      <w:r>
+        <w:t>Nouveau diag_04_protected_tables : pour chaque table à filtre de lignes ou masque de colonnes, indique si le compte qui l'exécute voit toutes les lignes et les valeurs réelles (COMPLETE, LIGNES_FILTREES, VALEURS_MASQUEES). À lancer sous l'identité du job de backup : c'est la condition pour qu'une copie par lecture de ces tables soit complète.</w:t>
+      </w:r>
+    </w:p>
+    <w:p>
+      <w:pPr>
+        <w:ind w:left="283"/>
+      </w:pPr>
+      <w:r>
+        <w:rPr>
+          <w:i/>
+          <w:color w:val="707070"/>
+          <w:sz w:val="20"/>
+        </w:rPr>
+        <w:t>Note : is_account_group_member() teste un groupe du compte Databricks, pas un groupe local au workspace : un compte membre du groupe « admins » du workspace n'est pas exempté par is_account_group_member('admins'). Vérifié sur l'environnement de test.</w:t>
+      </w:r>
+    </w:p>
+    <w:p>
+      <w:pPr>
         <w:pStyle w:val="Heading2"/>
         <w:jc w:val="left"/>
       </w:pPr>

</xml_diff>